<commit_message>
docs(patent): integrate edge-AI hardware architecture and algorithms into Form 2 specification and drawings according to standard template
</commit_message>
<xml_diff>
--- a/PATENT/Drawing_our_project.docx
+++ b/PATENT/Drawing_our_project.docx
@@ -102,7 +102,7 @@
       <w:r>
         <w:drawing>
           <wp:inline xmlns:a="http://schemas.openxmlformats.org/drawingml/2006/main" xmlns:pic="http://schemas.openxmlformats.org/drawingml/2006/picture">
-            <wp:extent cx="4500000" cy="5639241"/>
+            <wp:extent cx="4500000" cy="6360943"/>
             <wp:docPr id="2" name="Picture 2"/>
             <wp:cNvGraphicFramePr>
               <a:graphicFrameLocks noChangeAspect="1"/>
@@ -123,7 +123,7 @@
                   <pic:spPr>
                     <a:xfrm>
                       <a:off x="0" y="0"/>
-                      <a:ext cx="4500000" cy="5639241"/>
+                      <a:ext cx="4500000" cy="6360943"/>
                     </a:xfrm>
                     <a:prstGeom prst="rect"/>
                   </pic:spPr>

</xml_diff>